<commit_message>
Lecture 2, 8-25-26 added, Good Exit Ticket Answers added
</commit_message>
<xml_diff>
--- a/problem_sets/Problem Set 1.docx
+++ b/problem_sets/Problem Set 1.docx
@@ -124,7 +124,7 @@
           </mc:Choice>
           <mc:Fallback>
             <w:pict>
-              <v:line w14:anchorId="1664D5AE" id="Straight Connector 1" o:spid="_x0000_s1026" style="position:absolute;flip:y;z-index:251659264;visibility:visible;mso-wrap-style:square;mso-width-percent:0;mso-height-percent:0;mso-wrap-distance-left:9pt;mso-wrap-distance-top:0;mso-wrap-distance-right:9pt;mso-wrap-distance-bottom:0;mso-position-horizontal:absolute;mso-position-horizontal-relative:text;mso-position-vertical:absolute;mso-position-vertical-relative:text;mso-width-percent:0;mso-height-percent:0;mso-width-relative:margin;mso-height-relative:margin" from="0,17.3pt" to="465.85pt,17.3pt" o:gfxdata="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" strokecolor="#4472c4 [3204]" strokeweight="1.5pt">
+              <v:line w14:anchorId="6EA6E8D9" id="Straight Connector 1" o:spid="_x0000_s1026" style="position:absolute;flip:y;z-index:251659264;visibility:visible;mso-wrap-style:square;mso-width-percent:0;mso-height-percent:0;mso-wrap-distance-left:9pt;mso-wrap-distance-top:0;mso-wrap-distance-right:9pt;mso-wrap-distance-bottom:0;mso-position-horizontal:absolute;mso-position-horizontal-relative:text;mso-position-vertical:absolute;mso-position-vertical-relative:text;mso-width-percent:0;mso-height-percent:0;mso-width-relative:margin;mso-height-relative:margin" from="0,17.3pt" to="465.85pt,17.3pt" o:gfxdata="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" strokecolor="#4472c4 [3204]" strokeweight="1.5pt">
                 <v:stroke joinstyle="miter"/>
               </v:line>
             </w:pict>
@@ -336,6 +336,14 @@
           <w:bCs/>
         </w:rPr>
       </w:pPr>
+      <w:r>
+        <w:rPr>
+          <w:rFonts w:eastAsiaTheme="minorEastAsia"/>
+          <w:b/>
+          <w:bCs/>
+        </w:rPr>
+        <w:t xml:space="preserve">2. </w:t>
+      </w:r>
       <w:r>
         <w:rPr>
           <w:rFonts w:eastAsiaTheme="minorEastAsia"/>
@@ -541,6 +549,14 @@
           <w:b/>
           <w:bCs/>
         </w:rPr>
+        <w:t xml:space="preserve">3. </w:t>
+      </w:r>
+      <w:r>
+        <w:rPr>
+          <w:rFonts w:eastAsiaTheme="minorEastAsia"/>
+          <w:b/>
+          <w:bCs/>
+        </w:rPr>
         <w:t>Finite convolution and support</w:t>
       </w:r>
     </w:p>
@@ -708,7 +724,21 @@
         <w:rPr>
           <w:rFonts w:eastAsiaTheme="minorEastAsia"/>
         </w:rPr>
-        <w:t xml:space="preserve"> Verify the results with np.convolve.</w:t>
+        <w:t xml:space="preserve"> Verify the results with </w:t>
+      </w:r>
+      <w:proofErr w:type="spellStart"/>
+      <w:r>
+        <w:rPr>
+          <w:rFonts w:eastAsiaTheme="minorEastAsia"/>
+        </w:rPr>
+        <w:t>np.convolve</w:t>
+      </w:r>
+      <w:proofErr w:type="spellEnd"/>
+      <w:r>
+        <w:rPr>
+          <w:rFonts w:eastAsiaTheme="minorEastAsia"/>
+        </w:rPr>
+        <w:t>.</w:t>
       </w:r>
     </w:p>
     <w:p>
@@ -720,6 +750,14 @@
           <w:bCs/>
         </w:rPr>
       </w:pPr>
+      <w:r>
+        <w:rPr>
+          <w:rFonts w:eastAsiaTheme="minorEastAsia"/>
+          <w:b/>
+          <w:bCs/>
+        </w:rPr>
+        <w:t xml:space="preserve">4. </w:t>
+      </w:r>
       <w:r>
         <w:rPr>
           <w:rFonts w:eastAsiaTheme="minorEastAsia"/>
@@ -984,6 +1022,14 @@
           <w:bCs/>
         </w:rPr>
         <w:lastRenderedPageBreak/>
+        <w:t xml:space="preserve">5. </w:t>
+      </w:r>
+      <w:r>
+        <w:rPr>
+          <w:rFonts w:eastAsiaTheme="minorEastAsia"/>
+          <w:b/>
+          <w:bCs/>
+        </w:rPr>
         <w:t>BIBO stability proof for an LTI system (ECEN 5632 problem)</w:t>
       </w:r>
     </w:p>

</xml_diff>